<commit_message>
Add semana5 content + investment framework to strategy doc
Semana 5: BPO = Contas a Pagar e Receber / BI = BI para o Comercial.
8 files: 2 txt + 2 carousels + 2 LinkedIn infographics + 2 Instagram infographics.
Strategy doc updated with Section 6: investment decision framework
(which post, when to boost, how much per content type, monthly calendar).

Co-Authored-By: Claude Sonnet 4.6 <noreply@anthropic.com>
</commit_message>
<xml_diff>
--- a/p1p_content_generator/P1P_Estrategia_Publicacao.docx
+++ b/p1p_content_generator/P1P_Estrategia_Publicacao.docx
@@ -2145,7 +2145,1825 @@
           <w:color w:val="FFFFFF"/>
           <w:sz w:val="40"/>
         </w:rPr>
-        <w:t xml:space="preserve">  6. Impulsionamento — LinkedIn Campaign Manager</w:t>
+        <w:t xml:space="preserve">  6. Framework de Decisão de Investimento — Quanto, Quando e em Qual Post</w:t>
+      </w:r>
+    </w:p>
+    <w:p/>
+    <w:p>
+      <w:pPr>
+        <w:shd w:val="clear" w:color="auto" w:fill="EBF4FF"/>
+        <w:spacing w:before="80" w:after="80"/>
+        <w:ind w:left="227" w:right="227"/>
+        <w:pBdr>
+          <w:left w:val="single" w:sz="20" w:space="4" w:color="2A6DD9"/>
+        </w:pBdr>
+      </w:pPr>
+      <w:r>
+        <w:rPr>
+          <w:i/>
+          <w:color w:val="444444"/>
+          <w:sz w:val="21"/>
+        </w:rPr>
+        <w:t>Regra de ouro: nunca impulsione um post morto. O dinheiro amplifica o que já funciona — não ressuscita o que não funcionou organicamente.</w:t>
+      </w:r>
+    </w:p>
+    <w:p/>
+    <w:p>
+      <w:pPr>
+        <w:spacing w:before="160" w:after="20"/>
+      </w:pPr>
+      <w:r>
+        <w:rPr>
+          <w:b/>
+          <w:color w:val="444444"/>
+          <w:sz w:val="22"/>
+        </w:rPr>
+        <w:t>QUAL post impulsionar — Critério de elegibilidade</w:t>
+      </w:r>
+    </w:p>
+    <w:p>
+      <w:pPr>
+        <w:spacing w:before="20" w:after="60"/>
+      </w:pPr>
+      <w:r>
+        <w:rPr>
+          <w:i w:val="0"/>
+          <w:color w:val="444444"/>
+          <w:sz w:val="21"/>
+        </w:rPr>
+        <w:t>Avalie o post nas primeiras 2 horas após publicação:</w:t>
+      </w:r>
+    </w:p>
+    <w:tbl>
+      <w:tblPr>
+        <w:tblStyle w:val="TableGrid"/>
+        <w:tblW w:type="auto" w:w="0"/>
+        <w:tblLook w:firstColumn="1" w:firstRow="1" w:lastColumn="0" w:lastRow="0" w:noHBand="0" w:noVBand="1" w:val="04A0"/>
+        <w:jc w:val="left"/>
+        <w:tblBorders>
+          <w:top w:val="none"/>
+          <w:left w:val="none"/>
+          <w:bottom w:val="none"/>
+          <w:right w:val="none"/>
+          <w:insideH w:val="none"/>
+          <w:insideV w:val="none"/>
+        </w:tblBorders>
+      </w:tblPr>
+      <w:tblGrid>
+        <w:gridCol w:w="3135"/>
+        <w:gridCol w:w="3135"/>
+        <w:gridCol w:w="3135"/>
+      </w:tblGrid>
+      <w:tr>
+        <w:tc>
+          <w:tcPr>
+            <w:tcW w:type="dxa" w:w="3135"/>
+            <w:shd w:val="clear" w:color="auto" w:fill="0D1929"/>
+            <w:vAlign w:val="center"/>
+          </w:tcPr>
+          <w:p>
+            <w:pPr>
+              <w:spacing w:before="60" w:after="60"/>
+              <w:jc w:val="left"/>
+            </w:pPr>
+            <w:r>
+              <w:rPr>
+                <w:b/>
+                <w:color w:val="FFFFFF"/>
+                <w:sz w:val="19"/>
+              </w:rPr>
+              <w:t>Taxa de engajamento (2h)</w:t>
+            </w:r>
+          </w:p>
+        </w:tc>
+        <w:tc>
+          <w:tcPr>
+            <w:tcW w:type="dxa" w:w="3135"/>
+            <w:shd w:val="clear" w:color="auto" w:fill="0D1929"/>
+            <w:vAlign w:val="center"/>
+          </w:tcPr>
+          <w:p>
+            <w:pPr>
+              <w:spacing w:before="60" w:after="60"/>
+              <w:jc w:val="left"/>
+            </w:pPr>
+            <w:r>
+              <w:rPr>
+                <w:b/>
+                <w:color w:val="FFFFFF"/>
+                <w:sz w:val="19"/>
+              </w:rPr>
+              <w:t>Decisão</w:t>
+            </w:r>
+          </w:p>
+        </w:tc>
+        <w:tc>
+          <w:tcPr>
+            <w:tcW w:type="dxa" w:w="3135"/>
+            <w:shd w:val="clear" w:color="auto" w:fill="0D1929"/>
+            <w:vAlign w:val="center"/>
+          </w:tcPr>
+          <w:p>
+            <w:pPr>
+              <w:spacing w:before="60" w:after="60"/>
+              <w:jc w:val="left"/>
+            </w:pPr>
+            <w:r>
+              <w:rPr>
+                <w:b/>
+                <w:color w:val="FFFFFF"/>
+                <w:sz w:val="19"/>
+              </w:rPr>
+              <w:t>Ação</w:t>
+            </w:r>
+          </w:p>
+        </w:tc>
+      </w:tr>
+      <w:tr>
+        <w:tc>
+          <w:tcPr>
+            <w:tcW w:type="dxa" w:w="3135"/>
+            <w:shd w:val="clear" w:color="auto" w:fill="FFFFFF"/>
+            <w:vAlign w:val="center"/>
+          </w:tcPr>
+          <w:p>
+            <w:pPr>
+              <w:spacing w:before="60" w:after="60"/>
+            </w:pPr>
+            <w:r>
+              <w:rPr>
+                <w:color w:val="444444"/>
+                <w:sz w:val="20"/>
+              </w:rPr>
+              <w:t>Acima de 5%</w:t>
+            </w:r>
+          </w:p>
+        </w:tc>
+        <w:tc>
+          <w:tcPr>
+            <w:tcW w:type="dxa" w:w="3135"/>
+            <w:shd w:val="clear" w:color="auto" w:fill="FFFFFF"/>
+            <w:vAlign w:val="center"/>
+          </w:tcPr>
+          <w:p>
+            <w:pPr>
+              <w:spacing w:before="60" w:after="60"/>
+            </w:pPr>
+            <w:r>
+              <w:rPr>
+                <w:color w:val="444444"/>
+                <w:sz w:val="20"/>
+              </w:rPr>
+              <w:t>Boost imediato</w:t>
+            </w:r>
+          </w:p>
+        </w:tc>
+        <w:tc>
+          <w:tcPr>
+            <w:tcW w:type="dxa" w:w="3135"/>
+            <w:shd w:val="clear" w:color="auto" w:fill="FFFFFF"/>
+            <w:vAlign w:val="center"/>
+          </w:tcPr>
+          <w:p>
+            <w:pPr>
+              <w:spacing w:before="60" w:after="60"/>
+            </w:pPr>
+            <w:r>
+              <w:rPr>
+                <w:color w:val="444444"/>
+                <w:sz w:val="20"/>
+              </w:rPr>
+              <w:t>Impulsione nas próximas 6h — está quente</w:t>
+            </w:r>
+          </w:p>
+        </w:tc>
+      </w:tr>
+      <w:tr>
+        <w:tc>
+          <w:tcPr>
+            <w:tcW w:type="dxa" w:w="3135"/>
+            <w:shd w:val="clear" w:color="auto" w:fill="F2F4F8"/>
+            <w:vAlign w:val="center"/>
+          </w:tcPr>
+          <w:p>
+            <w:pPr>
+              <w:spacing w:before="60" w:after="60"/>
+            </w:pPr>
+            <w:r>
+              <w:rPr>
+                <w:color w:val="444444"/>
+                <w:sz w:val="20"/>
+              </w:rPr>
+              <w:t>Entre 3% e 5%</w:t>
+            </w:r>
+          </w:p>
+        </w:tc>
+        <w:tc>
+          <w:tcPr>
+            <w:tcW w:type="dxa" w:w="3135"/>
+            <w:shd w:val="clear" w:color="auto" w:fill="F2F4F8"/>
+            <w:vAlign w:val="center"/>
+          </w:tcPr>
+          <w:p>
+            <w:pPr>
+              <w:spacing w:before="60" w:after="60"/>
+            </w:pPr>
+            <w:r>
+              <w:rPr>
+                <w:color w:val="444444"/>
+                <w:sz w:val="20"/>
+              </w:rPr>
+              <w:t>Boost com critério</w:t>
+            </w:r>
+          </w:p>
+        </w:tc>
+        <w:tc>
+          <w:tcPr>
+            <w:tcW w:type="dxa" w:w="3135"/>
+            <w:shd w:val="clear" w:color="auto" w:fill="F2F4F8"/>
+            <w:vAlign w:val="center"/>
+          </w:tcPr>
+          <w:p>
+            <w:pPr>
+              <w:spacing w:before="60" w:after="60"/>
+            </w:pPr>
+            <w:r>
+              <w:rPr>
+                <w:color w:val="444444"/>
+                <w:sz w:val="20"/>
+              </w:rPr>
+              <w:t>Aguarde 24h; impulsione se ainda crescer</w:t>
+            </w:r>
+          </w:p>
+        </w:tc>
+      </w:tr>
+      <w:tr>
+        <w:tc>
+          <w:tcPr>
+            <w:tcW w:type="dxa" w:w="3135"/>
+            <w:shd w:val="clear" w:color="auto" w:fill="FFFFFF"/>
+            <w:vAlign w:val="center"/>
+          </w:tcPr>
+          <w:p>
+            <w:pPr>
+              <w:spacing w:before="60" w:after="60"/>
+            </w:pPr>
+            <w:r>
+              <w:rPr>
+                <w:color w:val="444444"/>
+                <w:sz w:val="20"/>
+              </w:rPr>
+              <w:t>Abaixo de 3%</w:t>
+            </w:r>
+          </w:p>
+        </w:tc>
+        <w:tc>
+          <w:tcPr>
+            <w:tcW w:type="dxa" w:w="3135"/>
+            <w:shd w:val="clear" w:color="auto" w:fill="FFFFFF"/>
+            <w:vAlign w:val="center"/>
+          </w:tcPr>
+          <w:p>
+            <w:pPr>
+              <w:spacing w:before="60" w:after="60"/>
+            </w:pPr>
+            <w:r>
+              <w:rPr>
+                <w:color w:val="444444"/>
+                <w:sz w:val="20"/>
+              </w:rPr>
+              <w:t>Não impulsionar</w:t>
+            </w:r>
+          </w:p>
+        </w:tc>
+        <w:tc>
+          <w:tcPr>
+            <w:tcW w:type="dxa" w:w="3135"/>
+            <w:shd w:val="clear" w:color="auto" w:fill="FFFFFF"/>
+            <w:vAlign w:val="center"/>
+          </w:tcPr>
+          <w:p>
+            <w:pPr>
+              <w:spacing w:before="60" w:after="60"/>
+            </w:pPr>
+            <w:r>
+              <w:rPr>
+                <w:color w:val="444444"/>
+                <w:sz w:val="20"/>
+              </w:rPr>
+              <w:t>Reutilize com nova legenda na semana seguinte</w:t>
+            </w:r>
+          </w:p>
+        </w:tc>
+      </w:tr>
+    </w:tbl>
+    <w:p>
+      <w:pPr>
+        <w:spacing w:after="80"/>
+      </w:pPr>
+    </w:p>
+    <w:p>
+      <w:pPr>
+        <w:spacing w:before="160" w:after="20"/>
+      </w:pPr>
+      <w:r>
+        <w:rPr>
+          <w:b/>
+          <w:color w:val="444444"/>
+          <w:sz w:val="22"/>
+        </w:rPr>
+        <w:t>QUANDO impulsionar — Timing por plataforma</w:t>
+      </w:r>
+    </w:p>
+    <w:tbl>
+      <w:tblPr>
+        <w:tblStyle w:val="TableGrid"/>
+        <w:tblW w:type="auto" w:w="0"/>
+        <w:tblLook w:firstColumn="1" w:firstRow="1" w:lastColumn="0" w:lastRow="0" w:noHBand="0" w:noVBand="1" w:val="04A0"/>
+        <w:jc w:val="left"/>
+        <w:tblBorders>
+          <w:top w:val="none"/>
+          <w:left w:val="none"/>
+          <w:bottom w:val="none"/>
+          <w:right w:val="none"/>
+          <w:insideH w:val="none"/>
+          <w:insideV w:val="none"/>
+        </w:tblBorders>
+      </w:tblPr>
+      <w:tblGrid>
+        <w:gridCol w:w="3135"/>
+        <w:gridCol w:w="3135"/>
+        <w:gridCol w:w="3135"/>
+      </w:tblGrid>
+      <w:tr>
+        <w:tc>
+          <w:tcPr>
+            <w:tcW w:type="dxa" w:w="3135"/>
+            <w:shd w:val="clear" w:color="auto" w:fill="0D1929"/>
+            <w:vAlign w:val="center"/>
+          </w:tcPr>
+          <w:p>
+            <w:pPr>
+              <w:spacing w:before="60" w:after="60"/>
+              <w:jc w:val="left"/>
+            </w:pPr>
+            <w:r>
+              <w:rPr>
+                <w:b/>
+                <w:color w:val="FFFFFF"/>
+                <w:sz w:val="19"/>
+              </w:rPr>
+              <w:t>Plataforma</w:t>
+            </w:r>
+          </w:p>
+        </w:tc>
+        <w:tc>
+          <w:tcPr>
+            <w:tcW w:type="dxa" w:w="3135"/>
+            <w:shd w:val="clear" w:color="auto" w:fill="0D1929"/>
+            <w:vAlign w:val="center"/>
+          </w:tcPr>
+          <w:p>
+            <w:pPr>
+              <w:spacing w:before="60" w:after="60"/>
+              <w:jc w:val="left"/>
+            </w:pPr>
+            <w:r>
+              <w:rPr>
+                <w:b/>
+                <w:color w:val="FFFFFF"/>
+                <w:sz w:val="19"/>
+              </w:rPr>
+              <w:t>Janela ideal</w:t>
+            </w:r>
+          </w:p>
+        </w:tc>
+        <w:tc>
+          <w:tcPr>
+            <w:tcW w:type="dxa" w:w="3135"/>
+            <w:shd w:val="clear" w:color="auto" w:fill="0D1929"/>
+            <w:vAlign w:val="center"/>
+          </w:tcPr>
+          <w:p>
+            <w:pPr>
+              <w:spacing w:before="60" w:after="60"/>
+              <w:jc w:val="left"/>
+            </w:pPr>
+            <w:r>
+              <w:rPr>
+                <w:b/>
+                <w:color w:val="FFFFFF"/>
+                <w:sz w:val="19"/>
+              </w:rPr>
+              <w:t>Por quê</w:t>
+            </w:r>
+          </w:p>
+        </w:tc>
+      </w:tr>
+      <w:tr>
+        <w:tc>
+          <w:tcPr>
+            <w:tcW w:type="dxa" w:w="3135"/>
+            <w:shd w:val="clear" w:color="auto" w:fill="FFFFFF"/>
+            <w:vAlign w:val="center"/>
+          </w:tcPr>
+          <w:p>
+            <w:pPr>
+              <w:spacing w:before="60" w:after="60"/>
+            </w:pPr>
+            <w:r>
+              <w:rPr>
+                <w:color w:val="444444"/>
+                <w:sz w:val="20"/>
+              </w:rPr>
+              <w:t>LinkedIn</w:t>
+            </w:r>
+          </w:p>
+        </w:tc>
+        <w:tc>
+          <w:tcPr>
+            <w:tcW w:type="dxa" w:w="3135"/>
+            <w:shd w:val="clear" w:color="auto" w:fill="FFFFFF"/>
+            <w:vAlign w:val="center"/>
+          </w:tcPr>
+          <w:p>
+            <w:pPr>
+              <w:spacing w:before="60" w:after="60"/>
+            </w:pPr>
+            <w:r>
+              <w:rPr>
+                <w:color w:val="444444"/>
+                <w:sz w:val="20"/>
+              </w:rPr>
+              <w:t>T+24h a T+48h após publicação</w:t>
+            </w:r>
+          </w:p>
+        </w:tc>
+        <w:tc>
+          <w:tcPr>
+            <w:tcW w:type="dxa" w:w="3135"/>
+            <w:shd w:val="clear" w:color="auto" w:fill="FFFFFF"/>
+            <w:vAlign w:val="center"/>
+          </w:tcPr>
+          <w:p>
+            <w:pPr>
+              <w:spacing w:before="60" w:after="60"/>
+            </w:pPr>
+            <w:r>
+              <w:rPr>
+                <w:color w:val="444444"/>
+                <w:sz w:val="20"/>
+              </w:rPr>
+              <w:t>Velocidade orgânica passa; paid estende sem concorrer</w:t>
+            </w:r>
+          </w:p>
+        </w:tc>
+      </w:tr>
+      <w:tr>
+        <w:tc>
+          <w:tcPr>
+            <w:tcW w:type="dxa" w:w="3135"/>
+            <w:shd w:val="clear" w:color="auto" w:fill="F2F4F8"/>
+            <w:vAlign w:val="center"/>
+          </w:tcPr>
+          <w:p>
+            <w:pPr>
+              <w:spacing w:before="60" w:after="60"/>
+            </w:pPr>
+            <w:r>
+              <w:rPr>
+                <w:color w:val="444444"/>
+                <w:sz w:val="20"/>
+              </w:rPr>
+              <w:t>Instagram</w:t>
+            </w:r>
+          </w:p>
+        </w:tc>
+        <w:tc>
+          <w:tcPr>
+            <w:tcW w:type="dxa" w:w="3135"/>
+            <w:shd w:val="clear" w:color="auto" w:fill="F2F4F8"/>
+            <w:vAlign w:val="center"/>
+          </w:tcPr>
+          <w:p>
+            <w:pPr>
+              <w:spacing w:before="60" w:after="60"/>
+            </w:pPr>
+            <w:r>
+              <w:rPr>
+                <w:color w:val="444444"/>
+                <w:sz w:val="20"/>
+              </w:rPr>
+              <w:t>T+2h a T+6h após publicação</w:t>
+            </w:r>
+          </w:p>
+        </w:tc>
+        <w:tc>
+          <w:tcPr>
+            <w:tcW w:type="dxa" w:w="3135"/>
+            <w:shd w:val="clear" w:color="auto" w:fill="F2F4F8"/>
+            <w:vAlign w:val="center"/>
+          </w:tcPr>
+          <w:p>
+            <w:pPr>
+              <w:spacing w:before="60" w:after="60"/>
+            </w:pPr>
+            <w:r>
+              <w:rPr>
+                <w:color w:val="444444"/>
+                <w:sz w:val="20"/>
+              </w:rPr>
+              <w:t>Algoritmo IG decai rápido — entrar cedo maximiza ROI</w:t>
+            </w:r>
+          </w:p>
+        </w:tc>
+      </w:tr>
+      <w:tr>
+        <w:tc>
+          <w:tcPr>
+            <w:tcW w:type="dxa" w:w="3135"/>
+            <w:shd w:val="clear" w:color="auto" w:fill="FFFFFF"/>
+            <w:vAlign w:val="center"/>
+          </w:tcPr>
+          <w:p>
+            <w:pPr>
+              <w:spacing w:before="60" w:after="60"/>
+            </w:pPr>
+            <w:r>
+              <w:rPr>
+                <w:color w:val="444444"/>
+                <w:sz w:val="20"/>
+              </w:rPr>
+              <w:t>Ambas</w:t>
+            </w:r>
+          </w:p>
+        </w:tc>
+        <w:tc>
+          <w:tcPr>
+            <w:tcW w:type="dxa" w:w="3135"/>
+            <w:shd w:val="clear" w:color="auto" w:fill="FFFFFF"/>
+            <w:vAlign w:val="center"/>
+          </w:tcPr>
+          <w:p>
+            <w:pPr>
+              <w:spacing w:before="60" w:after="60"/>
+            </w:pPr>
+            <w:r>
+              <w:rPr>
+                <w:color w:val="444444"/>
+                <w:sz w:val="20"/>
+              </w:rPr>
+              <w:t>Nunca após T+72h</w:t>
+            </w:r>
+          </w:p>
+        </w:tc>
+        <w:tc>
+          <w:tcPr>
+            <w:tcW w:type="dxa" w:w="3135"/>
+            <w:shd w:val="clear" w:color="auto" w:fill="FFFFFF"/>
+            <w:vAlign w:val="center"/>
+          </w:tcPr>
+          <w:p>
+            <w:pPr>
+              <w:spacing w:before="60" w:after="60"/>
+            </w:pPr>
+            <w:r>
+              <w:rPr>
+                <w:color w:val="444444"/>
+                <w:sz w:val="20"/>
+              </w:rPr>
+              <w:t>Memória do algoritmo se perde — custo sobe, resultado cai</w:t>
+            </w:r>
+          </w:p>
+        </w:tc>
+      </w:tr>
+    </w:tbl>
+    <w:p>
+      <w:pPr>
+        <w:spacing w:after="80"/>
+      </w:pPr>
+    </w:p>
+    <w:p>
+      <w:pPr>
+        <w:spacing w:before="160" w:after="20"/>
+      </w:pPr>
+      <w:r>
+        <w:rPr>
+          <w:b/>
+          <w:color w:val="444444"/>
+          <w:sz w:val="22"/>
+        </w:rPr>
+        <w:t>QUANTO investir — Por tipo de conteúdo</w:t>
+      </w:r>
+    </w:p>
+    <w:tbl>
+      <w:tblPr>
+        <w:tblStyle w:val="TableGrid"/>
+        <w:tblW w:type="auto" w:w="0"/>
+        <w:tblLook w:firstColumn="1" w:firstRow="1" w:lastColumn="0" w:lastRow="0" w:noHBand="0" w:noVBand="1" w:val="04A0"/>
+        <w:jc w:val="left"/>
+        <w:tblBorders>
+          <w:top w:val="none"/>
+          <w:left w:val="none"/>
+          <w:bottom w:val="none"/>
+          <w:right w:val="none"/>
+          <w:insideH w:val="none"/>
+          <w:insideV w:val="none"/>
+        </w:tblBorders>
+      </w:tblPr>
+      <w:tblGrid>
+        <w:gridCol w:w="1568"/>
+        <w:gridCol w:w="1568"/>
+        <w:gridCol w:w="1568"/>
+        <w:gridCol w:w="1568"/>
+        <w:gridCol w:w="1568"/>
+        <w:gridCol w:w="1568"/>
+      </w:tblGrid>
+      <w:tr>
+        <w:tc>
+          <w:tcPr>
+            <w:tcW w:type="dxa" w:w="1568"/>
+            <w:shd w:val="clear" w:color="auto" w:fill="0D1929"/>
+            <w:vAlign w:val="center"/>
+          </w:tcPr>
+          <w:p>
+            <w:pPr>
+              <w:spacing w:before="60" w:after="60"/>
+              <w:jc w:val="left"/>
+            </w:pPr>
+            <w:r>
+              <w:rPr>
+                <w:b/>
+                <w:color w:val="FFFFFF"/>
+                <w:sz w:val="19"/>
+              </w:rPr>
+              <w:t>Tipo de conteúdo</w:t>
+            </w:r>
+          </w:p>
+        </w:tc>
+        <w:tc>
+          <w:tcPr>
+            <w:tcW w:type="dxa" w:w="1568"/>
+            <w:shd w:val="clear" w:color="auto" w:fill="0D1929"/>
+            <w:vAlign w:val="center"/>
+          </w:tcPr>
+          <w:p>
+            <w:pPr>
+              <w:spacing w:before="60" w:after="60"/>
+              <w:jc w:val="left"/>
+            </w:pPr>
+            <w:r>
+              <w:rPr>
+                <w:b/>
+                <w:color w:val="FFFFFF"/>
+                <w:sz w:val="19"/>
+              </w:rPr>
+              <w:t>Plataforma</w:t>
+            </w:r>
+          </w:p>
+        </w:tc>
+        <w:tc>
+          <w:tcPr>
+            <w:tcW w:type="dxa" w:w="1568"/>
+            <w:shd w:val="clear" w:color="auto" w:fill="0D1929"/>
+            <w:vAlign w:val="center"/>
+          </w:tcPr>
+          <w:p>
+            <w:pPr>
+              <w:spacing w:before="60" w:after="60"/>
+              <w:jc w:val="left"/>
+            </w:pPr>
+            <w:r>
+              <w:rPr>
+                <w:b/>
+                <w:color w:val="FFFFFF"/>
+                <w:sz w:val="19"/>
+              </w:rPr>
+              <w:t>R$/dia</w:t>
+            </w:r>
+          </w:p>
+        </w:tc>
+        <w:tc>
+          <w:tcPr>
+            <w:tcW w:type="dxa" w:w="1568"/>
+            <w:shd w:val="clear" w:color="auto" w:fill="0D1929"/>
+            <w:vAlign w:val="center"/>
+          </w:tcPr>
+          <w:p>
+            <w:pPr>
+              <w:spacing w:before="60" w:after="60"/>
+              <w:jc w:val="left"/>
+            </w:pPr>
+            <w:r>
+              <w:rPr>
+                <w:b/>
+                <w:color w:val="FFFFFF"/>
+                <w:sz w:val="19"/>
+              </w:rPr>
+              <w:t>Duração</w:t>
+            </w:r>
+          </w:p>
+        </w:tc>
+        <w:tc>
+          <w:tcPr>
+            <w:tcW w:type="dxa" w:w="1568"/>
+            <w:shd w:val="clear" w:color="auto" w:fill="0D1929"/>
+            <w:vAlign w:val="center"/>
+          </w:tcPr>
+          <w:p>
+            <w:pPr>
+              <w:spacing w:before="60" w:after="60"/>
+              <w:jc w:val="left"/>
+            </w:pPr>
+            <w:r>
+              <w:rPr>
+                <w:b/>
+                <w:color w:val="FFFFFF"/>
+                <w:sz w:val="19"/>
+              </w:rPr>
+              <w:t>Total</w:t>
+            </w:r>
+          </w:p>
+        </w:tc>
+        <w:tc>
+          <w:tcPr>
+            <w:tcW w:type="dxa" w:w="1568"/>
+            <w:shd w:val="clear" w:color="auto" w:fill="0D1929"/>
+            <w:vAlign w:val="center"/>
+          </w:tcPr>
+          <w:p>
+            <w:pPr>
+              <w:spacing w:before="60" w:after="60"/>
+              <w:jc w:val="left"/>
+            </w:pPr>
+            <w:r>
+              <w:rPr>
+                <w:b/>
+                <w:color w:val="FFFFFF"/>
+                <w:sz w:val="19"/>
+              </w:rPr>
+              <w:t>Objetivo</w:t>
+            </w:r>
+          </w:p>
+        </w:tc>
+      </w:tr>
+      <w:tr>
+        <w:tc>
+          <w:tcPr>
+            <w:tcW w:type="dxa" w:w="1568"/>
+            <w:shd w:val="clear" w:color="auto" w:fill="FFFFFF"/>
+            <w:vAlign w:val="center"/>
+          </w:tcPr>
+          <w:p>
+            <w:pPr>
+              <w:spacing w:before="60" w:after="60"/>
+            </w:pPr>
+            <w:r>
+              <w:rPr>
+                <w:color w:val="444444"/>
+                <w:sz w:val="20"/>
+              </w:rPr>
+              <w:t>Carrossel</w:t>
+            </w:r>
+          </w:p>
+        </w:tc>
+        <w:tc>
+          <w:tcPr>
+            <w:tcW w:type="dxa" w:w="1568"/>
+            <w:shd w:val="clear" w:color="auto" w:fill="FFFFFF"/>
+            <w:vAlign w:val="center"/>
+          </w:tcPr>
+          <w:p>
+            <w:pPr>
+              <w:spacing w:before="60" w:after="60"/>
+            </w:pPr>
+            <w:r>
+              <w:rPr>
+                <w:color w:val="444444"/>
+                <w:sz w:val="20"/>
+              </w:rPr>
+              <w:t>Instagram</w:t>
+            </w:r>
+          </w:p>
+        </w:tc>
+        <w:tc>
+          <w:tcPr>
+            <w:tcW w:type="dxa" w:w="1568"/>
+            <w:shd w:val="clear" w:color="auto" w:fill="FFFFFF"/>
+            <w:vAlign w:val="center"/>
+          </w:tcPr>
+          <w:p>
+            <w:pPr>
+              <w:spacing w:before="60" w:after="60"/>
+            </w:pPr>
+            <w:r>
+              <w:rPr>
+                <w:color w:val="444444"/>
+                <w:sz w:val="20"/>
+              </w:rPr>
+              <w:t>R$40</w:t>
+            </w:r>
+          </w:p>
+        </w:tc>
+        <w:tc>
+          <w:tcPr>
+            <w:tcW w:type="dxa" w:w="1568"/>
+            <w:shd w:val="clear" w:color="auto" w:fill="FFFFFF"/>
+            <w:vAlign w:val="center"/>
+          </w:tcPr>
+          <w:p>
+            <w:pPr>
+              <w:spacing w:before="60" w:after="60"/>
+            </w:pPr>
+            <w:r>
+              <w:rPr>
+                <w:color w:val="444444"/>
+                <w:sz w:val="20"/>
+              </w:rPr>
+              <w:t>5 dias</w:t>
+            </w:r>
+          </w:p>
+        </w:tc>
+        <w:tc>
+          <w:tcPr>
+            <w:tcW w:type="dxa" w:w="1568"/>
+            <w:shd w:val="clear" w:color="auto" w:fill="FFFFFF"/>
+            <w:vAlign w:val="center"/>
+          </w:tcPr>
+          <w:p>
+            <w:pPr>
+              <w:spacing w:before="60" w:after="60"/>
+            </w:pPr>
+            <w:r>
+              <w:rPr>
+                <w:color w:val="444444"/>
+                <w:sz w:val="20"/>
+              </w:rPr>
+              <w:t>R$200</w:t>
+            </w:r>
+          </w:p>
+        </w:tc>
+        <w:tc>
+          <w:tcPr>
+            <w:tcW w:type="dxa" w:w="1568"/>
+            <w:shd w:val="clear" w:color="auto" w:fill="FFFFFF"/>
+            <w:vAlign w:val="center"/>
+          </w:tcPr>
+          <w:p>
+            <w:pPr>
+              <w:spacing w:before="60" w:after="60"/>
+            </w:pPr>
+            <w:r>
+              <w:rPr>
+                <w:color w:val="444444"/>
+                <w:sz w:val="20"/>
+              </w:rPr>
+              <w:t>Alcance + retargeting</w:t>
+            </w:r>
+          </w:p>
+        </w:tc>
+      </w:tr>
+      <w:tr>
+        <w:tc>
+          <w:tcPr>
+            <w:tcW w:type="dxa" w:w="1568"/>
+            <w:shd w:val="clear" w:color="auto" w:fill="F2F4F8"/>
+            <w:vAlign w:val="center"/>
+          </w:tcPr>
+          <w:p>
+            <w:pPr>
+              <w:spacing w:before="60" w:after="60"/>
+            </w:pPr>
+            <w:r>
+              <w:rPr>
+                <w:color w:val="444444"/>
+                <w:sz w:val="20"/>
+              </w:rPr>
+              <w:t>Infográfico</w:t>
+            </w:r>
+          </w:p>
+        </w:tc>
+        <w:tc>
+          <w:tcPr>
+            <w:tcW w:type="dxa" w:w="1568"/>
+            <w:shd w:val="clear" w:color="auto" w:fill="F2F4F8"/>
+            <w:vAlign w:val="center"/>
+          </w:tcPr>
+          <w:p>
+            <w:pPr>
+              <w:spacing w:before="60" w:after="60"/>
+            </w:pPr>
+            <w:r>
+              <w:rPr>
+                <w:color w:val="444444"/>
+                <w:sz w:val="20"/>
+              </w:rPr>
+              <w:t>LinkedIn</w:t>
+            </w:r>
+          </w:p>
+        </w:tc>
+        <w:tc>
+          <w:tcPr>
+            <w:tcW w:type="dxa" w:w="1568"/>
+            <w:shd w:val="clear" w:color="auto" w:fill="F2F4F8"/>
+            <w:vAlign w:val="center"/>
+          </w:tcPr>
+          <w:p>
+            <w:pPr>
+              <w:spacing w:before="60" w:after="60"/>
+            </w:pPr>
+            <w:r>
+              <w:rPr>
+                <w:color w:val="444444"/>
+                <w:sz w:val="20"/>
+              </w:rPr>
+              <w:t>R$40</w:t>
+            </w:r>
+          </w:p>
+        </w:tc>
+        <w:tc>
+          <w:tcPr>
+            <w:tcW w:type="dxa" w:w="1568"/>
+            <w:shd w:val="clear" w:color="auto" w:fill="F2F4F8"/>
+            <w:vAlign w:val="center"/>
+          </w:tcPr>
+          <w:p>
+            <w:pPr>
+              <w:spacing w:before="60" w:after="60"/>
+            </w:pPr>
+            <w:r>
+              <w:rPr>
+                <w:color w:val="444444"/>
+                <w:sz w:val="20"/>
+              </w:rPr>
+              <w:t>7 dias</w:t>
+            </w:r>
+          </w:p>
+        </w:tc>
+        <w:tc>
+          <w:tcPr>
+            <w:tcW w:type="dxa" w:w="1568"/>
+            <w:shd w:val="clear" w:color="auto" w:fill="F2F4F8"/>
+            <w:vAlign w:val="center"/>
+          </w:tcPr>
+          <w:p>
+            <w:pPr>
+              <w:spacing w:before="60" w:after="60"/>
+            </w:pPr>
+            <w:r>
+              <w:rPr>
+                <w:color w:val="444444"/>
+                <w:sz w:val="20"/>
+              </w:rPr>
+              <w:t>R$280</w:t>
+            </w:r>
+          </w:p>
+        </w:tc>
+        <w:tc>
+          <w:tcPr>
+            <w:tcW w:type="dxa" w:w="1568"/>
+            <w:shd w:val="clear" w:color="auto" w:fill="F2F4F8"/>
+            <w:vAlign w:val="center"/>
+          </w:tcPr>
+          <w:p>
+            <w:pPr>
+              <w:spacing w:before="60" w:after="60"/>
+            </w:pPr>
+            <w:r>
+              <w:rPr>
+                <w:color w:val="444444"/>
+                <w:sz w:val="20"/>
+              </w:rPr>
+              <w:t>Lead Gen Form direto</w:t>
+            </w:r>
+          </w:p>
+        </w:tc>
+      </w:tr>
+      <w:tr>
+        <w:tc>
+          <w:tcPr>
+            <w:tcW w:type="dxa" w:w="1568"/>
+            <w:shd w:val="clear" w:color="auto" w:fill="FFFFFF"/>
+            <w:vAlign w:val="center"/>
+          </w:tcPr>
+          <w:p>
+            <w:pPr>
+              <w:spacing w:before="60" w:after="60"/>
+            </w:pPr>
+            <w:r>
+              <w:rPr>
+                <w:color w:val="444444"/>
+                <w:sz w:val="20"/>
+              </w:rPr>
+              <w:t>Texto longo</w:t>
+            </w:r>
+          </w:p>
+        </w:tc>
+        <w:tc>
+          <w:tcPr>
+            <w:tcW w:type="dxa" w:w="1568"/>
+            <w:shd w:val="clear" w:color="auto" w:fill="FFFFFF"/>
+            <w:vAlign w:val="center"/>
+          </w:tcPr>
+          <w:p>
+            <w:pPr>
+              <w:spacing w:before="60" w:after="60"/>
+            </w:pPr>
+            <w:r>
+              <w:rPr>
+                <w:color w:val="444444"/>
+                <w:sz w:val="20"/>
+              </w:rPr>
+              <w:t>LinkedIn</w:t>
+            </w:r>
+          </w:p>
+        </w:tc>
+        <w:tc>
+          <w:tcPr>
+            <w:tcW w:type="dxa" w:w="1568"/>
+            <w:shd w:val="clear" w:color="auto" w:fill="FFFFFF"/>
+            <w:vAlign w:val="center"/>
+          </w:tcPr>
+          <w:p>
+            <w:pPr>
+              <w:spacing w:before="60" w:after="60"/>
+            </w:pPr>
+            <w:r>
+              <w:rPr>
+                <w:color w:val="444444"/>
+                <w:sz w:val="20"/>
+              </w:rPr>
+              <w:t>R$30</w:t>
+            </w:r>
+          </w:p>
+        </w:tc>
+        <w:tc>
+          <w:tcPr>
+            <w:tcW w:type="dxa" w:w="1568"/>
+            <w:shd w:val="clear" w:color="auto" w:fill="FFFFFF"/>
+            <w:vAlign w:val="center"/>
+          </w:tcPr>
+          <w:p>
+            <w:pPr>
+              <w:spacing w:before="60" w:after="60"/>
+            </w:pPr>
+            <w:r>
+              <w:rPr>
+                <w:color w:val="444444"/>
+                <w:sz w:val="20"/>
+              </w:rPr>
+              <w:t>5 dias</w:t>
+            </w:r>
+          </w:p>
+        </w:tc>
+        <w:tc>
+          <w:tcPr>
+            <w:tcW w:type="dxa" w:w="1568"/>
+            <w:shd w:val="clear" w:color="auto" w:fill="FFFFFF"/>
+            <w:vAlign w:val="center"/>
+          </w:tcPr>
+          <w:p>
+            <w:pPr>
+              <w:spacing w:before="60" w:after="60"/>
+            </w:pPr>
+            <w:r>
+              <w:rPr>
+                <w:color w:val="444444"/>
+                <w:sz w:val="20"/>
+              </w:rPr>
+              <w:t>R$150</w:t>
+            </w:r>
+          </w:p>
+        </w:tc>
+        <w:tc>
+          <w:tcPr>
+            <w:tcW w:type="dxa" w:w="1568"/>
+            <w:shd w:val="clear" w:color="auto" w:fill="FFFFFF"/>
+            <w:vAlign w:val="center"/>
+          </w:tcPr>
+          <w:p>
+            <w:pPr>
+              <w:spacing w:before="60" w:after="60"/>
+            </w:pPr>
+            <w:r>
+              <w:rPr>
+                <w:color w:val="444444"/>
+                <w:sz w:val="20"/>
+              </w:rPr>
+              <w:t>Tráfego para perfil</w:t>
+            </w:r>
+          </w:p>
+        </w:tc>
+      </w:tr>
+      <w:tr>
+        <w:tc>
+          <w:tcPr>
+            <w:tcW w:type="dxa" w:w="1568"/>
+            <w:shd w:val="clear" w:color="auto" w:fill="F2F4F8"/>
+            <w:vAlign w:val="center"/>
+          </w:tcPr>
+          <w:p>
+            <w:pPr>
+              <w:spacing w:before="60" w:after="60"/>
+            </w:pPr>
+            <w:r>
+              <w:rPr>
+                <w:color w:val="444444"/>
+                <w:sz w:val="20"/>
+              </w:rPr>
+              <w:t>Infográfico IG</w:t>
+            </w:r>
+          </w:p>
+        </w:tc>
+        <w:tc>
+          <w:tcPr>
+            <w:tcW w:type="dxa" w:w="1568"/>
+            <w:shd w:val="clear" w:color="auto" w:fill="F2F4F8"/>
+            <w:vAlign w:val="center"/>
+          </w:tcPr>
+          <w:p>
+            <w:pPr>
+              <w:spacing w:before="60" w:after="60"/>
+            </w:pPr>
+            <w:r>
+              <w:rPr>
+                <w:color w:val="444444"/>
+                <w:sz w:val="20"/>
+              </w:rPr>
+              <w:t>Instagram</w:t>
+            </w:r>
+          </w:p>
+        </w:tc>
+        <w:tc>
+          <w:tcPr>
+            <w:tcW w:type="dxa" w:w="1568"/>
+            <w:shd w:val="clear" w:color="auto" w:fill="F2F4F8"/>
+            <w:vAlign w:val="center"/>
+          </w:tcPr>
+          <w:p>
+            <w:pPr>
+              <w:spacing w:before="60" w:after="60"/>
+            </w:pPr>
+            <w:r>
+              <w:rPr>
+                <w:color w:val="444444"/>
+                <w:sz w:val="20"/>
+              </w:rPr>
+              <w:t>R$20</w:t>
+            </w:r>
+          </w:p>
+        </w:tc>
+        <w:tc>
+          <w:tcPr>
+            <w:tcW w:type="dxa" w:w="1568"/>
+            <w:shd w:val="clear" w:color="auto" w:fill="F2F4F8"/>
+            <w:vAlign w:val="center"/>
+          </w:tcPr>
+          <w:p>
+            <w:pPr>
+              <w:spacing w:before="60" w:after="60"/>
+            </w:pPr>
+            <w:r>
+              <w:rPr>
+                <w:color w:val="444444"/>
+                <w:sz w:val="20"/>
+              </w:rPr>
+              <w:t>5 dias</w:t>
+            </w:r>
+          </w:p>
+        </w:tc>
+        <w:tc>
+          <w:tcPr>
+            <w:tcW w:type="dxa" w:w="1568"/>
+            <w:shd w:val="clear" w:color="auto" w:fill="F2F4F8"/>
+            <w:vAlign w:val="center"/>
+          </w:tcPr>
+          <w:p>
+            <w:pPr>
+              <w:spacing w:before="60" w:after="60"/>
+            </w:pPr>
+            <w:r>
+              <w:rPr>
+                <w:color w:val="444444"/>
+                <w:sz w:val="20"/>
+              </w:rPr>
+              <w:t>R$100</w:t>
+            </w:r>
+          </w:p>
+        </w:tc>
+        <w:tc>
+          <w:tcPr>
+            <w:tcW w:type="dxa" w:w="1568"/>
+            <w:shd w:val="clear" w:color="auto" w:fill="F2F4F8"/>
+            <w:vAlign w:val="center"/>
+          </w:tcPr>
+          <w:p>
+            <w:pPr>
+              <w:spacing w:before="60" w:after="60"/>
+            </w:pPr>
+            <w:r>
+              <w:rPr>
+                <w:color w:val="444444"/>
+                <w:sz w:val="20"/>
+              </w:rPr>
+              <w:t>Awareness + seguidores</w:t>
+            </w:r>
+          </w:p>
+        </w:tc>
+      </w:tr>
+    </w:tbl>
+    <w:p>
+      <w:pPr>
+        <w:spacing w:after="80"/>
+      </w:pPr>
+    </w:p>
+    <w:p>
+      <w:pPr>
+        <w:spacing w:before="160" w:after="20"/>
+      </w:pPr>
+      <w:r>
+        <w:rPr>
+          <w:b/>
+          <w:color w:val="444444"/>
+          <w:sz w:val="22"/>
+        </w:rPr>
+        <w:t>Calendário de investimento mensal — R$500</w:t>
+      </w:r>
+    </w:p>
+    <w:tbl>
+      <w:tblPr>
+        <w:tblStyle w:val="TableGrid"/>
+        <w:tblW w:type="auto" w:w="0"/>
+        <w:tblLook w:firstColumn="1" w:firstRow="1" w:lastColumn="0" w:lastRow="0" w:noHBand="0" w:noVBand="1" w:val="04A0"/>
+        <w:jc w:val="left"/>
+        <w:tblBorders>
+          <w:top w:val="none"/>
+          <w:left w:val="none"/>
+          <w:bottom w:val="none"/>
+          <w:right w:val="none"/>
+          <w:insideH w:val="none"/>
+          <w:insideV w:val="none"/>
+        </w:tblBorders>
+      </w:tblPr>
+      <w:tblGrid>
+        <w:gridCol w:w="2351"/>
+        <w:gridCol w:w="2351"/>
+        <w:gridCol w:w="2351"/>
+        <w:gridCol w:w="2351"/>
+      </w:tblGrid>
+      <w:tr>
+        <w:tc>
+          <w:tcPr>
+            <w:tcW w:type="dxa" w:w="2351"/>
+            <w:shd w:val="clear" w:color="auto" w:fill="0D1929"/>
+            <w:vAlign w:val="center"/>
+          </w:tcPr>
+          <w:p>
+            <w:pPr>
+              <w:spacing w:before="60" w:after="60"/>
+              <w:jc w:val="left"/>
+            </w:pPr>
+            <w:r>
+              <w:rPr>
+                <w:b/>
+                <w:color w:val="FFFFFF"/>
+                <w:sz w:val="19"/>
+              </w:rPr>
+              <w:t>Semana</w:t>
+            </w:r>
+          </w:p>
+        </w:tc>
+        <w:tc>
+          <w:tcPr>
+            <w:tcW w:type="dxa" w:w="2351"/>
+            <w:shd w:val="clear" w:color="auto" w:fill="0D1929"/>
+            <w:vAlign w:val="center"/>
+          </w:tcPr>
+          <w:p>
+            <w:pPr>
+              <w:spacing w:before="60" w:after="60"/>
+              <w:jc w:val="left"/>
+            </w:pPr>
+            <w:r>
+              <w:rPr>
+                <w:b/>
+                <w:color w:val="FFFFFF"/>
+                <w:sz w:val="19"/>
+              </w:rPr>
+              <w:t>O que impulsionar</w:t>
+            </w:r>
+          </w:p>
+        </w:tc>
+        <w:tc>
+          <w:tcPr>
+            <w:tcW w:type="dxa" w:w="2351"/>
+            <w:shd w:val="clear" w:color="auto" w:fill="0D1929"/>
+            <w:vAlign w:val="center"/>
+          </w:tcPr>
+          <w:p>
+            <w:pPr>
+              <w:spacing w:before="60" w:after="60"/>
+              <w:jc w:val="left"/>
+            </w:pPr>
+            <w:r>
+              <w:rPr>
+                <w:b/>
+                <w:color w:val="FFFFFF"/>
+                <w:sz w:val="19"/>
+              </w:rPr>
+              <w:t>Plataforma</w:t>
+            </w:r>
+          </w:p>
+        </w:tc>
+        <w:tc>
+          <w:tcPr>
+            <w:tcW w:type="dxa" w:w="2351"/>
+            <w:shd w:val="clear" w:color="auto" w:fill="0D1929"/>
+            <w:vAlign w:val="center"/>
+          </w:tcPr>
+          <w:p>
+            <w:pPr>
+              <w:spacing w:before="60" w:after="60"/>
+              <w:jc w:val="left"/>
+            </w:pPr>
+            <w:r>
+              <w:rPr>
+                <w:b/>
+                <w:color w:val="FFFFFF"/>
+                <w:sz w:val="19"/>
+              </w:rPr>
+              <w:t>Valor</w:t>
+            </w:r>
+          </w:p>
+        </w:tc>
+      </w:tr>
+      <w:tr>
+        <w:tc>
+          <w:tcPr>
+            <w:tcW w:type="dxa" w:w="2351"/>
+            <w:shd w:val="clear" w:color="auto" w:fill="FFFFFF"/>
+            <w:vAlign w:val="center"/>
+          </w:tcPr>
+          <w:p>
+            <w:pPr>
+              <w:spacing w:before="60" w:after="60"/>
+            </w:pPr>
+            <w:r>
+              <w:rPr>
+                <w:color w:val="444444"/>
+                <w:sz w:val="20"/>
+              </w:rPr>
+              <w:t>Semana 1</w:t>
+            </w:r>
+          </w:p>
+        </w:tc>
+        <w:tc>
+          <w:tcPr>
+            <w:tcW w:type="dxa" w:w="2351"/>
+            <w:shd w:val="clear" w:color="auto" w:fill="FFFFFF"/>
+            <w:vAlign w:val="center"/>
+          </w:tcPr>
+          <w:p>
+            <w:pPr>
+              <w:spacing w:before="60" w:after="60"/>
+            </w:pPr>
+            <w:r>
+              <w:rPr>
+                <w:color w:val="444444"/>
+                <w:sz w:val="20"/>
+              </w:rPr>
+              <w:t>Melhor post orgânico da semana anterior</w:t>
+            </w:r>
+          </w:p>
+        </w:tc>
+        <w:tc>
+          <w:tcPr>
+            <w:tcW w:type="dxa" w:w="2351"/>
+            <w:shd w:val="clear" w:color="auto" w:fill="FFFFFF"/>
+            <w:vAlign w:val="center"/>
+          </w:tcPr>
+          <w:p>
+            <w:pPr>
+              <w:spacing w:before="60" w:after="60"/>
+            </w:pPr>
+            <w:r>
+              <w:rPr>
+                <w:color w:val="444444"/>
+                <w:sz w:val="20"/>
+              </w:rPr>
+              <w:t>LinkedIn</w:t>
+            </w:r>
+          </w:p>
+        </w:tc>
+        <w:tc>
+          <w:tcPr>
+            <w:tcW w:type="dxa" w:w="2351"/>
+            <w:shd w:val="clear" w:color="auto" w:fill="FFFFFF"/>
+            <w:vAlign w:val="center"/>
+          </w:tcPr>
+          <w:p>
+            <w:pPr>
+              <w:spacing w:before="60" w:after="60"/>
+            </w:pPr>
+            <w:r>
+              <w:rPr>
+                <w:color w:val="444444"/>
+                <w:sz w:val="20"/>
+              </w:rPr>
+              <w:t>R$150</w:t>
+            </w:r>
+          </w:p>
+        </w:tc>
+      </w:tr>
+      <w:tr>
+        <w:tc>
+          <w:tcPr>
+            <w:tcW w:type="dxa" w:w="2351"/>
+            <w:shd w:val="clear" w:color="auto" w:fill="F2F4F8"/>
+            <w:vAlign w:val="center"/>
+          </w:tcPr>
+          <w:p>
+            <w:pPr>
+              <w:spacing w:before="60" w:after="60"/>
+            </w:pPr>
+            <w:r>
+              <w:rPr>
+                <w:color w:val="444444"/>
+                <w:sz w:val="20"/>
+              </w:rPr>
+              <w:t>Semana 2</w:t>
+            </w:r>
+          </w:p>
+        </w:tc>
+        <w:tc>
+          <w:tcPr>
+            <w:tcW w:type="dxa" w:w="2351"/>
+            <w:shd w:val="clear" w:color="auto" w:fill="F2F4F8"/>
+            <w:vAlign w:val="center"/>
+          </w:tcPr>
+          <w:p>
+            <w:pPr>
+              <w:spacing w:before="60" w:after="60"/>
+            </w:pPr>
+            <w:r>
+              <w:rPr>
+                <w:color w:val="444444"/>
+                <w:sz w:val="20"/>
+              </w:rPr>
+              <w:t>Carrossel (se engajamento ≥ 3%)</w:t>
+            </w:r>
+          </w:p>
+        </w:tc>
+        <w:tc>
+          <w:tcPr>
+            <w:tcW w:type="dxa" w:w="2351"/>
+            <w:shd w:val="clear" w:color="auto" w:fill="F2F4F8"/>
+            <w:vAlign w:val="center"/>
+          </w:tcPr>
+          <w:p>
+            <w:pPr>
+              <w:spacing w:before="60" w:after="60"/>
+            </w:pPr>
+            <w:r>
+              <w:rPr>
+                <w:color w:val="444444"/>
+                <w:sz w:val="20"/>
+              </w:rPr>
+              <w:t>Instagram</w:t>
+            </w:r>
+          </w:p>
+        </w:tc>
+        <w:tc>
+          <w:tcPr>
+            <w:tcW w:type="dxa" w:w="2351"/>
+            <w:shd w:val="clear" w:color="auto" w:fill="F2F4F8"/>
+            <w:vAlign w:val="center"/>
+          </w:tcPr>
+          <w:p>
+            <w:pPr>
+              <w:spacing w:before="60" w:after="60"/>
+            </w:pPr>
+            <w:r>
+              <w:rPr>
+                <w:color w:val="444444"/>
+                <w:sz w:val="20"/>
+              </w:rPr>
+              <w:t>R$200</w:t>
+            </w:r>
+          </w:p>
+        </w:tc>
+      </w:tr>
+      <w:tr>
+        <w:tc>
+          <w:tcPr>
+            <w:tcW w:type="dxa" w:w="2351"/>
+            <w:shd w:val="clear" w:color="auto" w:fill="FFFFFF"/>
+            <w:vAlign w:val="center"/>
+          </w:tcPr>
+          <w:p>
+            <w:pPr>
+              <w:spacing w:before="60" w:after="60"/>
+            </w:pPr>
+            <w:r>
+              <w:rPr>
+                <w:color w:val="444444"/>
+                <w:sz w:val="20"/>
+              </w:rPr>
+              <w:t>Semana 3</w:t>
+            </w:r>
+          </w:p>
+        </w:tc>
+        <w:tc>
+          <w:tcPr>
+            <w:tcW w:type="dxa" w:w="2351"/>
+            <w:shd w:val="clear" w:color="auto" w:fill="FFFFFF"/>
+            <w:vAlign w:val="center"/>
+          </w:tcPr>
+          <w:p>
+            <w:pPr>
+              <w:spacing w:before="60" w:after="60"/>
+            </w:pPr>
+            <w:r>
+              <w:rPr>
+                <w:color w:val="444444"/>
+                <w:sz w:val="20"/>
+              </w:rPr>
+              <w:t>Infográfico (se engajamento ≥ 3%)</w:t>
+            </w:r>
+          </w:p>
+        </w:tc>
+        <w:tc>
+          <w:tcPr>
+            <w:tcW w:type="dxa" w:w="2351"/>
+            <w:shd w:val="clear" w:color="auto" w:fill="FFFFFF"/>
+            <w:vAlign w:val="center"/>
+          </w:tcPr>
+          <w:p>
+            <w:pPr>
+              <w:spacing w:before="60" w:after="60"/>
+            </w:pPr>
+            <w:r>
+              <w:rPr>
+                <w:color w:val="444444"/>
+                <w:sz w:val="20"/>
+              </w:rPr>
+              <w:t>LinkedIn</w:t>
+            </w:r>
+          </w:p>
+        </w:tc>
+        <w:tc>
+          <w:tcPr>
+            <w:tcW w:type="dxa" w:w="2351"/>
+            <w:shd w:val="clear" w:color="auto" w:fill="FFFFFF"/>
+            <w:vAlign w:val="center"/>
+          </w:tcPr>
+          <w:p>
+            <w:pPr>
+              <w:spacing w:before="60" w:after="60"/>
+            </w:pPr>
+            <w:r>
+              <w:rPr>
+                <w:color w:val="444444"/>
+                <w:sz w:val="20"/>
+              </w:rPr>
+              <w:t>R$150</w:t>
+            </w:r>
+          </w:p>
+        </w:tc>
+      </w:tr>
+      <w:tr>
+        <w:tc>
+          <w:tcPr>
+            <w:tcW w:type="dxa" w:w="2351"/>
+            <w:shd w:val="clear" w:color="auto" w:fill="F2F4F8"/>
+            <w:vAlign w:val="center"/>
+          </w:tcPr>
+          <w:p>
+            <w:pPr>
+              <w:spacing w:before="60" w:after="60"/>
+            </w:pPr>
+            <w:r>
+              <w:rPr>
+                <w:color w:val="444444"/>
+                <w:sz w:val="20"/>
+              </w:rPr>
+              <w:t>Semana 4</w:t>
+            </w:r>
+          </w:p>
+        </w:tc>
+        <w:tc>
+          <w:tcPr>
+            <w:tcW w:type="dxa" w:w="2351"/>
+            <w:shd w:val="clear" w:color="auto" w:fill="F2F4F8"/>
+            <w:vAlign w:val="center"/>
+          </w:tcPr>
+          <w:p>
+            <w:pPr>
+              <w:spacing w:before="60" w:after="60"/>
+            </w:pPr>
+            <w:r>
+              <w:rPr>
+                <w:color w:val="444444"/>
+                <w:sz w:val="20"/>
+              </w:rPr>
+              <w:t>Retargeting — quem interagiu com o carrossel</w:t>
+            </w:r>
+          </w:p>
+        </w:tc>
+        <w:tc>
+          <w:tcPr>
+            <w:tcW w:type="dxa" w:w="2351"/>
+            <w:shd w:val="clear" w:color="auto" w:fill="F2F4F8"/>
+            <w:vAlign w:val="center"/>
+          </w:tcPr>
+          <w:p>
+            <w:pPr>
+              <w:spacing w:before="60" w:after="60"/>
+            </w:pPr>
+            <w:r>
+              <w:rPr>
+                <w:color w:val="444444"/>
+                <w:sz w:val="20"/>
+              </w:rPr>
+              <w:t>Instagram / LinkedIn</w:t>
+            </w:r>
+          </w:p>
+        </w:tc>
+        <w:tc>
+          <w:tcPr>
+            <w:tcW w:type="dxa" w:w="2351"/>
+            <w:shd w:val="clear" w:color="auto" w:fill="F2F4F8"/>
+            <w:vAlign w:val="center"/>
+          </w:tcPr>
+          <w:p>
+            <w:pPr>
+              <w:spacing w:before="60" w:after="60"/>
+            </w:pPr>
+            <w:r>
+              <w:rPr>
+                <w:color w:val="444444"/>
+                <w:sz w:val="20"/>
+              </w:rPr>
+              <w:t>R$0 — audiência já paga</w:t>
+            </w:r>
+          </w:p>
+        </w:tc>
+      </w:tr>
+    </w:tbl>
+    <w:p>
+      <w:pPr>
+        <w:spacing w:after="80"/>
+      </w:pPr>
+    </w:p>
+    <w:p>
+      <w:pPr>
+        <w:shd w:val="clear" w:color="auto" w:fill="EBF4FF"/>
+        <w:spacing w:before="80" w:after="80"/>
+        <w:ind w:left="227" w:right="227"/>
+        <w:pBdr>
+          <w:left w:val="single" w:sz="20" w:space="4" w:color="2A6DD9"/>
+        </w:pBdr>
+      </w:pPr>
+      <w:r>
+        <w:rPr>
+          <w:i/>
+          <w:color w:val="444444"/>
+          <w:sz w:val="21"/>
+        </w:rPr>
+        <w:t>Se nenhum post atingir o critério de elegibilidade em uma semana, não gaste o orçamento. Guarde para dobrar na semana seguinte em um post forte.</w:t>
+      </w:r>
+    </w:p>
+    <w:p>
+      <w:pPr>
+        <w:spacing w:before="160" w:after="20"/>
+      </w:pPr>
+      <w:r>
+        <w:rPr>
+          <w:b/>
+          <w:color w:val="444444"/>
+          <w:sz w:val="22"/>
+        </w:rPr>
+        <w:t>Prioridade de conteúdo para investimento pago</w:t>
+      </w:r>
+    </w:p>
+    <w:p>
+      <w:pPr>
+        <w:spacing w:before="20" w:after="60"/>
+      </w:pPr>
+      <w:r>
+        <w:rPr>
+          <w:i w:val="0"/>
+          <w:color w:val="444444"/>
+          <w:sz w:val="21"/>
+        </w:rPr>
+        <w:t>Nem todo conteúdo tem o mesmo retorno. Ordem de prioridade:</w:t>
+      </w:r>
+    </w:p>
+    <w:p>
+      <w:pPr>
+        <w:pStyle w:val="ListBullet"/>
+        <w:spacing w:before="20" w:after="20"/>
+      </w:pPr>
+      <w:r>
+        <w:rPr>
+          <w:b/>
+          <w:color w:val="0D1929"/>
+          <w:sz w:val="21"/>
+        </w:rPr>
+        <w:t>1º — Carrossel BPO (Instagram)</w:t>
+      </w:r>
+      <w:r>
+        <w:rPr>
+          <w:color w:val="444444"/>
+          <w:sz w:val="21"/>
+        </w:rPr>
+        <w:t xml:space="preserve"> → maior tempo de permanência → menor CPM → melhor pool de retargeting</w:t>
+      </w:r>
+    </w:p>
+    <w:p>
+      <w:pPr>
+        <w:pStyle w:val="ListBullet"/>
+        <w:spacing w:before="20" w:after="20"/>
+      </w:pPr>
+      <w:r>
+        <w:rPr>
+          <w:b/>
+          <w:color w:val="0D1929"/>
+          <w:sz w:val="21"/>
+        </w:rPr>
+        <w:t>2º — Infográfico LinkedIn (Lead Gen Form)</w:t>
+      </w:r>
+      <w:r>
+        <w:rPr>
+          <w:color w:val="444444"/>
+          <w:sz w:val="21"/>
+        </w:rPr>
+        <w:t xml:space="preserve"> → maior intenção → custo por lead mais controlado</w:t>
+      </w:r>
+    </w:p>
+    <w:p>
+      <w:pPr>
+        <w:pStyle w:val="ListBullet"/>
+        <w:spacing w:before="20" w:after="20"/>
+      </w:pPr>
+      <w:r>
+        <w:rPr>
+          <w:b/>
+          <w:color w:val="0D1929"/>
+          <w:sz w:val="21"/>
+        </w:rPr>
+        <w:t>3º — Carrossel BI (Instagram)</w:t>
+      </w:r>
+      <w:r>
+        <w:rPr>
+          <w:color w:val="444444"/>
+          <w:sz w:val="21"/>
+        </w:rPr>
+        <w:t xml:space="preserve"> → aquece audiência técnica — CTOs, gestores de TI</w:t>
+      </w:r>
+    </w:p>
+    <w:p>
+      <w:pPr>
+        <w:pStyle w:val="ListBullet"/>
+        <w:spacing w:before="20" w:after="20"/>
+      </w:pPr>
+      <w:r>
+        <w:rPr>
+          <w:b/>
+          <w:color w:val="0D1929"/>
+          <w:sz w:val="21"/>
+        </w:rPr>
+        <w:t>4º — Texto longo LinkedIn</w:t>
+      </w:r>
+      <w:r>
+        <w:rPr>
+          <w:color w:val="444444"/>
+          <w:sz w:val="21"/>
+        </w:rPr>
+        <w:t xml:space="preserve"> → menor prioridade para paid; funciona melhor orgânico</w:t>
+      </w:r>
+    </w:p>
+    <w:p>
+      <w:pPr>
+        <w:pBdr>
+          <w:bottom w:val="single" w:sz="4" w:space="1" w:color="2A6DD9"/>
+        </w:pBdr>
+        <w:spacing w:before="120" w:after="120"/>
+      </w:pPr>
+    </w:p>
+    <w:p>
+      <w:pPr>
+        <w:shd w:val="clear" w:color="auto" w:fill="0D1929"/>
+        <w:spacing w:before="120" w:after="80"/>
+        <w:ind w:left="170"/>
+      </w:pPr>
+      <w:r>
+        <w:rPr>
+          <w:b/>
+          <w:color w:val="FFFFFF"/>
+          <w:sz w:val="40"/>
+        </w:rPr>
+        <w:t xml:space="preserve">  7. Impulsionamento — LinkedIn Campaign Manager</w:t>
       </w:r>
     </w:p>
     <w:p/>
@@ -2945,7 +4763,7 @@
           <w:color w:val="FFFFFF"/>
           <w:sz w:val="40"/>
         </w:rPr>
-        <w:t xml:space="preserve">  7. Impulsionamento — Meta Ads Manager (Instagram)</w:t>
+        <w:t xml:space="preserve">  8. Impulsionamento — Meta Ads Manager (Instagram)</w:t>
       </w:r>
     </w:p>
     <w:p/>
@@ -3264,7 +5082,7 @@
           <w:color w:val="FFFFFF"/>
           <w:sz w:val="40"/>
         </w:rPr>
-        <w:t xml:space="preserve">  8. Amplificação — Além das Publicações</w:t>
+        <w:t xml:space="preserve">  9. Amplificação — Além das Publicações</w:t>
       </w:r>
     </w:p>
     <w:p/>
@@ -3418,7 +5236,7 @@
           <w:color w:val="FFFFFF"/>
           <w:sz w:val="40"/>
         </w:rPr>
-        <w:t xml:space="preserve">  9. Métricas para Acompanhar (Revisão Mensal)</w:t>
+        <w:t xml:space="preserve">  10. Métricas para Acompanhar (Revisão Mensal)</w:t>
       </w:r>
     </w:p>
     <w:p/>
@@ -3742,7 +5560,7 @@
           <w:color w:val="FFFFFF"/>
           <w:sz w:val="40"/>
         </w:rPr>
-        <w:t xml:space="preserve">  10. Resumo de Orçamento Mensal</w:t>
+        <w:t xml:space="preserve">  11. Resumo de Orçamento Mensal</w:t>
       </w:r>
     </w:p>
     <w:p/>
@@ -4051,7 +5869,7 @@
           <w:color w:val="FFFFFF"/>
           <w:sz w:val="40"/>
         </w:rPr>
-        <w:t xml:space="preserve">  11. Ritmo Mensal de Conteúdo</w:t>
+        <w:t xml:space="preserve">  12. Ritmo Mensal de Conteúdo</w:t>
       </w:r>
     </w:p>
     <w:p/>
@@ -4304,7 +6122,7 @@
           <w:color w:val="FFFFFF"/>
           <w:sz w:val="40"/>
         </w:rPr>
-        <w:t xml:space="preserve">  12. O que Fazer Agora — Por Prioridade</w:t>
+        <w:t xml:space="preserve">  13. O que Fazer Agora — Por Prioridade</w:t>
       </w:r>
     </w:p>
     <w:p/>

</xml_diff>